<commit_message>
docs(underwriting): name the legal entity, Next Level Rec.
Co-Authored-By: Claude Fable 5.1 <noreply@anthropic.com>
</commit_message>
<xml_diff>
--- a/docs/underwriting/HumanCrush-Underwriting-Response.docx
+++ b/docs/underwriting/HumanCrush-Underwriting-Response.docx
@@ -84,7 +84,7 @@
           <w:sz w:val="22"/>
           <w:szCs w:val="22"/>
         </w:rPr>
-        <w:t xml:space="preserve">Legal entity: ______________________________ (as on the application forms)</w:t>
+        <w:t xml:space="preserve">Legal entity: Next Level Rec. (as on the application forms)</w:t>
       </w:r>
     </w:p>
     <w:p>
@@ -4172,7 +4172,7 @@
           <w:sz w:val="22"/>
           <w:szCs w:val="22"/>
         </w:rPr>
-        <w:t xml:space="preserve">These Terms of Service ("Terms") govern your use of HumanCrush.com (the "Service"), operated by HumanCrush ("we", "us"). By creating an account or using the Service you agree to these Terms, our Privacy Policy and our Prohibited Content Policy. If you do not agree, do not use the Service.</w:t>
+        <w:t xml:space="preserve">These Terms of Service ("Terms") govern your use of HumanCrush.com (the "Service"), operated by Next Level Rec. ("HumanCrush", "we", "us"). By creating an account or using the Service you agree to these Terms, our Privacy Policy and our Prohibited Content Policy. If you do not agree, do not use the Service.</w:t>
       </w:r>
     </w:p>
     <w:p>

</xml_diff>